<commit_message>
Math T5 — Unité IV Géométrie : 9 séances complètes + scènes u3s5-7 et u4s1-7, rebuild U3
Co-authored-by: arena-agent <297053741+arena-agent@users.noreply.github.com>
</commit_message>
<xml_diff>
--- a/manuel-math-t5/Manuel_Mathematiques_T5_UNITE3.docx
+++ b/manuel-math-t5/Manuel_Mathematiques_T5_UNITE3.docx
@@ -14313,96 +14313,13 @@
     </w:p>
     <w:p>
       <w:pPr>
-        <w:spacing w:after="110" w:line="300"/>
-        <w:jc w:val="both"/>
-      </w:pPr>
-      <w:r>
-        <w:rPr>
-          <w:rFonts w:ascii="Times New Roman" w:cs="Times New Roman" w:eastAsia="Times New Roman" w:hAnsi="Times New Roman"/>
-          <w:b/>
-          <w:bCs/>
-          <w:i w:val="false"/>
-          <w:iCs w:val="false"/>
-          <w:color w:val="2E7D32"/>
-          <w:sz w:val="24"/>
-          <w:szCs w:val="24"/>
-        </w:rPr>
-        <w:t xml:space="preserve">Définition — </w:t>
-      </w:r>
-      <w:r>
-        <w:rPr>
-          <w:rFonts w:ascii="Times New Roman" w:cs="Times New Roman" w:eastAsia="Times New Roman" w:hAnsi="Times New Roman"/>
-          <w:b/>
-          <w:bCs/>
-          <w:i w:val="false"/>
-          <w:iCs w:val="false"/>
-          <w:color w:val="000000"/>
-          <w:sz w:val="24"/>
-          <w:szCs w:val="24"/>
-        </w:rPr>
-        <w:t xml:space="preserve">La règle de trois permet de trouver une quatrième valeur quand trois valeurs proportionnelles sont connues : on multiplie, puis on divise. Pour 9 stylos sachant que 3 stylos coûtent 700 Ar, on écrit l’équation : prix = (9 × 700) ÷ 3 = 2 100 Ar.</w:t>
-      </w:r>
-    </w:p>
-    <w:p>
-      <w:pPr>
-        <w:spacing w:after="110" w:line="300"/>
-        <w:jc w:val="both"/>
-      </w:pPr>
-      <w:r>
-        <w:rPr>
-          <w:rFonts w:ascii="Times New Roman" w:cs="Times New Roman" w:eastAsia="Times New Roman" w:hAnsi="Times New Roman"/>
-          <w:b/>
-          <w:bCs/>
-          <w:i w:val="false"/>
-          <w:iCs w:val="false"/>
-          <w:color w:val="1F4E79"/>
-          <w:sz w:val="24"/>
-          <w:szCs w:val="24"/>
-        </w:rPr>
-        <w:t xml:space="preserve">Autrement dit : </w:t>
-      </w:r>
-      <w:r>
-        <w:rPr>
-          <w:rFonts w:ascii="Times New Roman" w:cs="Times New Roman" w:eastAsia="Times New Roman" w:hAnsi="Times New Roman"/>
-          <w:b w:val="false"/>
-          <w:bCs w:val="false"/>
-          <w:i w:val="false"/>
-          <w:iCs w:val="false"/>
-          <w:color w:val="000000"/>
-          <w:sz w:val="24"/>
-          <w:szCs w:val="24"/>
-        </w:rPr>
-        <w:t xml:space="preserve">on paie « 9 fois le prix de 700 Ar »… mais comme 700 Ar couvre 3 stylos, on divise par 3 : multiplier par le nouveau, diviser par l’ancien.</w:t>
-      </w:r>
-    </w:p>
-    <w:p>
-      <w:pPr>
-        <w:spacing w:after="110" w:line="300"/>
-        <w:jc w:val="both"/>
-      </w:pPr>
-      <w:r>
-        <w:rPr>
-          <w:rFonts w:ascii="Times New Roman" w:cs="Times New Roman" w:eastAsia="Times New Roman" w:hAnsi="Times New Roman"/>
-          <w:b w:val="false"/>
-          <w:bCs w:val="false"/>
-          <w:i w:val="false"/>
-          <w:iCs w:val="false"/>
-          <w:color w:val="000000"/>
-          <w:sz w:val="24"/>
-          <w:szCs w:val="24"/>
-        </w:rPr>
-        <w:t xml:space="preserve">Pourquoi ça marche ? Deux lectures du même calcul. Lecture par paquets : 9 stylos = 3 paquets de 3 stylos → 3 × 700 = 2 100 Ar ; la règle de trois fait pareil, dans un autre ordre : (9 × 700) ÷ 3 = 9 ÷ 3 × 700. Lecture par l’unité : 700 ÷ 3 serait le prix d’un stylo, multiplié ensuite par 9 — mais en multipliant D’ABORD (9 × 700 = 6 300), on évite la division qui ne tombe pas juste, et 6 300 ÷ 3 = 2 100 tombe rond. C’est tout l’avantage de l’ordre « multiplier puis diviser ». La règle de trois exige la proportionnalité (prix au même tarif, pas de remise !) et un tableau bien posé : les quantités de même nature l’une sous l’autre, pour ne pas mélanger stylos et ariary.</w:t>
-      </w:r>
-    </w:p>
-    <w:p>
-      <w:pPr>
         <w:spacing w:after="120" w:before="120"/>
         <w:jc w:val="center"/>
       </w:pPr>
       <w:r>
         <w:drawing>
           <wp:inline distT="0" distB="0" distL="0" distR="0">
-            <wp:extent cx="4762500" cy="1924050"/>
+            <wp:extent cx="4095750" cy="2238375"/>
             <wp:effectExtent t="0" r="0" b="0" l="0"/>
             <wp:docPr id="9" name="" descr="" title=""/>
             <wp:cNvGraphicFramePr>
@@ -14419,6 +14336,135 @@
                   </pic:nvPicPr>
                   <pic:blipFill>
                     <a:blip r:embed="rId17" cstate="none"/>
+                    <a:srcRect/>
+                    <a:stretch>
+                      <a:fillRect/>
+                    </a:stretch>
+                  </pic:blipFill>
+                  <pic:spPr bwMode="auto">
+                    <a:xfrm>
+                      <a:off x="0" y="0"/>
+                      <a:ext cx="4095750" cy="2238375"/>
+                    </a:xfrm>
+                    <a:prstGeom prst="rect">
+                      <a:avLst/>
+                    </a:prstGeom>
+                  </pic:spPr>
+                </pic:pic>
+              </a:graphicData>
+            </a:graphic>
+          </wp:inline>
+        </w:drawing>
+      </w:r>
+    </w:p>
+    <w:p>
+      <w:pPr>
+        <w:spacing w:after="110" w:line="300"/>
+        <w:jc w:val="both"/>
+      </w:pPr>
+      <w:r>
+        <w:rPr>
+          <w:rFonts w:ascii="Times New Roman" w:cs="Times New Roman" w:eastAsia="Times New Roman" w:hAnsi="Times New Roman"/>
+          <w:b/>
+          <w:bCs/>
+          <w:i w:val="false"/>
+          <w:iCs w:val="false"/>
+          <w:color w:val="2E7D32"/>
+          <w:sz w:val="24"/>
+          <w:szCs w:val="24"/>
+        </w:rPr>
+        <w:t xml:space="preserve">Définition — </w:t>
+      </w:r>
+      <w:r>
+        <w:rPr>
+          <w:rFonts w:ascii="Times New Roman" w:cs="Times New Roman" w:eastAsia="Times New Roman" w:hAnsi="Times New Roman"/>
+          <w:b/>
+          <w:bCs/>
+          <w:i w:val="false"/>
+          <w:iCs w:val="false"/>
+          <w:color w:val="000000"/>
+          <w:sz w:val="24"/>
+          <w:szCs w:val="24"/>
+        </w:rPr>
+        <w:t xml:space="preserve">La règle de trois permet de trouver une quatrième valeur quand trois valeurs proportionnelles sont connues : on multiplie, puis on divise. Pour 9 stylos sachant que 3 stylos coûtent 700 Ar, on écrit l’équation : prix = (9 × 700) ÷ 3 = 2 100 Ar.</w:t>
+      </w:r>
+    </w:p>
+    <w:p>
+      <w:pPr>
+        <w:spacing w:after="110" w:line="300"/>
+        <w:jc w:val="both"/>
+      </w:pPr>
+      <w:r>
+        <w:rPr>
+          <w:rFonts w:ascii="Times New Roman" w:cs="Times New Roman" w:eastAsia="Times New Roman" w:hAnsi="Times New Roman"/>
+          <w:b/>
+          <w:bCs/>
+          <w:i w:val="false"/>
+          <w:iCs w:val="false"/>
+          <w:color w:val="1F4E79"/>
+          <w:sz w:val="24"/>
+          <w:szCs w:val="24"/>
+        </w:rPr>
+        <w:t xml:space="preserve">Autrement dit : </w:t>
+      </w:r>
+      <w:r>
+        <w:rPr>
+          <w:rFonts w:ascii="Times New Roman" w:cs="Times New Roman" w:eastAsia="Times New Roman" w:hAnsi="Times New Roman"/>
+          <w:b w:val="false"/>
+          <w:bCs w:val="false"/>
+          <w:i w:val="false"/>
+          <w:iCs w:val="false"/>
+          <w:color w:val="000000"/>
+          <w:sz w:val="24"/>
+          <w:szCs w:val="24"/>
+        </w:rPr>
+        <w:t xml:space="preserve">on paie « 9 fois le prix de 700 Ar »… mais comme 700 Ar couvre 3 stylos, on divise par 3 : multiplier par le nouveau, diviser par l’ancien.</w:t>
+      </w:r>
+    </w:p>
+    <w:p>
+      <w:pPr>
+        <w:spacing w:after="110" w:line="300"/>
+        <w:jc w:val="both"/>
+      </w:pPr>
+      <w:r>
+        <w:rPr>
+          <w:rFonts w:ascii="Times New Roman" w:cs="Times New Roman" w:eastAsia="Times New Roman" w:hAnsi="Times New Roman"/>
+          <w:b w:val="false"/>
+          <w:bCs w:val="false"/>
+          <w:i w:val="false"/>
+          <w:iCs w:val="false"/>
+          <w:color w:val="000000"/>
+          <w:sz w:val="24"/>
+          <w:szCs w:val="24"/>
+        </w:rPr>
+        <w:t xml:space="preserve">Pourquoi ça marche ? Deux lectures du même calcul. Lecture par paquets : 9 stylos = 3 paquets de 3 stylos → 3 × 700 = 2 100 Ar ; la règle de trois fait pareil, dans un autre ordre : (9 × 700) ÷ 3 = 9 ÷ 3 × 700. Lecture par l’unité : 700 ÷ 3 serait le prix d’un stylo, multiplié ensuite par 9 — mais en multipliant D’ABORD (9 × 700 = 6 300), on évite la division qui ne tombe pas juste, et 6 300 ÷ 3 = 2 100 tombe rond. C’est tout l’avantage de l’ordre « multiplier puis diviser ». La règle de trois exige la proportionnalité (prix au même tarif, pas de remise !) et un tableau bien posé : les quantités de même nature l’une sous l’autre, pour ne pas mélanger stylos et ariary.</w:t>
+      </w:r>
+    </w:p>
+    <w:p>
+      <w:pPr>
+        <w:spacing w:after="120" w:before="120"/>
+        <w:jc w:val="center"/>
+      </w:pPr>
+      <w:r>
+        <w:drawing>
+          <wp:inline distT="0" distB="0" distL="0" distR="0">
+            <wp:extent cx="4762500" cy="1924050"/>
+            <wp:effectExtent t="0" r="0" b="0" l="0"/>
+            <wp:docPr id="10" name="" descr="" title=""/>
+            <wp:cNvGraphicFramePr>
+              <a:graphicFrameLocks xmlns:a="http://schemas.openxmlformats.org/drawingml/2006/main" noChangeAspect="1"/>
+            </wp:cNvGraphicFramePr>
+            <a:graphic xmlns:a="http://schemas.openxmlformats.org/drawingml/2006/main">
+              <a:graphicData uri="http://schemas.openxmlformats.org/drawingml/2006/picture">
+                <pic:pic xmlns:pic="http://schemas.openxmlformats.org/drawingml/2006/picture">
+                  <pic:nvPicPr>
+                    <pic:cNvPr id="0" name="" descr=""/>
+                    <pic:cNvPicPr>
+                      <a:picLocks noChangeAspect="1" noChangeArrowheads="1"/>
+                    </pic:cNvPicPr>
+                  </pic:nvPicPr>
+                  <pic:blipFill>
+                    <a:blip r:embed="rId18" cstate="none"/>
                     <a:srcRect/>
                     <a:stretch>
                       <a:fillRect/>
@@ -17162,98 +17208,15 @@
     </w:p>
     <w:p>
       <w:pPr>
-        <w:spacing w:after="110" w:line="300"/>
-        <w:jc w:val="both"/>
-      </w:pPr>
-      <w:r>
-        <w:rPr>
-          <w:rFonts w:ascii="Times New Roman" w:cs="Times New Roman" w:eastAsia="Times New Roman" w:hAnsi="Times New Roman"/>
-          <w:b/>
-          <w:bCs/>
-          <w:i w:val="false"/>
-          <w:iCs w:val="false"/>
-          <w:color w:val="2E7D32"/>
-          <w:sz w:val="24"/>
-          <w:szCs w:val="24"/>
-        </w:rPr>
-        <w:t xml:space="preserve">Définition — </w:t>
-      </w:r>
-      <w:r>
-        <w:rPr>
-          <w:rFonts w:ascii="Times New Roman" w:cs="Times New Roman" w:eastAsia="Times New Roman" w:hAnsi="Times New Roman"/>
-          <w:b/>
-          <w:bCs/>
-          <w:i w:val="false"/>
-          <w:iCs w:val="false"/>
-          <w:color w:val="000000"/>
-          <w:sz w:val="24"/>
-          <w:szCs w:val="24"/>
-        </w:rPr>
-        <w:t xml:space="preserve">Le signe égal (=) exprime une équivalence : il affirme que les expressions écrites à sa gauche et à sa droite ont exactement la même valeur. Deux expressions différentes peuvent être équivalentes : 7 + 5 = 10 + 2, car les deux valent 12.</w:t>
-      </w:r>
-    </w:p>
-    <w:p>
-      <w:pPr>
-        <w:spacing w:after="110" w:line="300"/>
-        <w:jc w:val="both"/>
-      </w:pPr>
-      <w:r>
-        <w:rPr>
-          <w:rFonts w:ascii="Times New Roman" w:cs="Times New Roman" w:eastAsia="Times New Roman" w:hAnsi="Times New Roman"/>
-          <w:b/>
-          <w:bCs/>
-          <w:i w:val="false"/>
-          <w:iCs w:val="false"/>
-          <w:color w:val="1F4E79"/>
-          <w:sz w:val="24"/>
-          <w:szCs w:val="24"/>
-        </w:rPr>
-        <w:t xml:space="preserve">Autrement dit : </w:t>
-      </w:r>
-      <w:r>
-        <w:rPr>
-          <w:rFonts w:ascii="Times New Roman" w:cs="Times New Roman" w:eastAsia="Times New Roman" w:hAnsi="Times New Roman"/>
-          <w:b w:val="false"/>
-          <w:bCs w:val="false"/>
-          <w:i w:val="false"/>
-          <w:iCs w:val="false"/>
-          <w:color w:val="000000"/>
-          <w:sz w:val="24"/>
-          <w:szCs w:val="24"/>
-        </w:rPr>
-        <w:t xml:space="preserve">le = est une balance en équilibre : ce qu’il y a à gauche pèse exactement autant que ce qu’il y a à droite.</w:t>
-      </w:r>
-    </w:p>
-    <w:p>
-      <w:pPr>
-        <w:spacing w:after="110" w:line="300"/>
-        <w:jc w:val="both"/>
-      </w:pPr>
-      <w:r>
-        <w:rPr>
-          <w:rFonts w:ascii="Times New Roman" w:cs="Times New Roman" w:eastAsia="Times New Roman" w:hAnsi="Times New Roman"/>
-          <w:b w:val="false"/>
-          <w:bCs w:val="false"/>
-          <w:i w:val="false"/>
-          <w:iCs w:val="false"/>
-          <w:color w:val="000000"/>
-          <w:sz w:val="24"/>
-          <w:szCs w:val="24"/>
-        </w:rPr>
-        <w:t xml:space="preserve">Depuis le CP, beaucoup lisent le = comme un bouton « résultat » de calculatrice : « 7 + 5 égale… 12 ! ». Cette lecture fait écrire des horreurs en chaîne comme « 7 + 5 = 12 + 3 = 15 » (faux : 7 + 5 ne vaut pas 15 !). La vraie lecture est symétrique : chaque côté est une expression, et le = certifie qu’elles pèsent pareil. D’où trois pouvoirs nouveaux. Compléter : 8 + □ = 6 + 7 → la droite pèse 13, donc □ = 5. Vérifier : 25 − 8 = 15 + 2 ? Gauche 17, droite 17 : vrai. Transformer : 99 + 46 = 100 + 45 — la compensation du calcul mental n’était qu’une égalité d’équivalence ! La balance à plateaux rend tout cela visible : on charge les deux plateaux, et l’aiguille dit la vérité.</w:t>
-      </w:r>
-    </w:p>
-    <w:p>
-      <w:pPr>
         <w:spacing w:after="120" w:before="120"/>
         <w:jc w:val="center"/>
       </w:pPr>
       <w:r>
         <w:drawing>
           <wp:inline distT="0" distB="0" distL="0" distR="0">
-            <wp:extent cx="4762500" cy="1895475"/>
+            <wp:extent cx="4095750" cy="2238375"/>
             <wp:effectExtent t="0" r="0" b="0" l="0"/>
-            <wp:docPr id="10" name="" descr="" title=""/>
+            <wp:docPr id="11" name="" descr="" title=""/>
             <wp:cNvGraphicFramePr>
               <a:graphicFrameLocks xmlns:a="http://schemas.openxmlformats.org/drawingml/2006/main" noChangeAspect="1"/>
             </wp:cNvGraphicFramePr>
@@ -17267,7 +17230,136 @@
                     </pic:cNvPicPr>
                   </pic:nvPicPr>
                   <pic:blipFill>
-                    <a:blip r:embed="rId18" cstate="none"/>
+                    <a:blip r:embed="rId19" cstate="none"/>
+                    <a:srcRect/>
+                    <a:stretch>
+                      <a:fillRect/>
+                    </a:stretch>
+                  </pic:blipFill>
+                  <pic:spPr bwMode="auto">
+                    <a:xfrm>
+                      <a:off x="0" y="0"/>
+                      <a:ext cx="4095750" cy="2238375"/>
+                    </a:xfrm>
+                    <a:prstGeom prst="rect">
+                      <a:avLst/>
+                    </a:prstGeom>
+                  </pic:spPr>
+                </pic:pic>
+              </a:graphicData>
+            </a:graphic>
+          </wp:inline>
+        </w:drawing>
+      </w:r>
+    </w:p>
+    <w:p>
+      <w:pPr>
+        <w:spacing w:after="110" w:line="300"/>
+        <w:jc w:val="both"/>
+      </w:pPr>
+      <w:r>
+        <w:rPr>
+          <w:rFonts w:ascii="Times New Roman" w:cs="Times New Roman" w:eastAsia="Times New Roman" w:hAnsi="Times New Roman"/>
+          <w:b/>
+          <w:bCs/>
+          <w:i w:val="false"/>
+          <w:iCs w:val="false"/>
+          <w:color w:val="2E7D32"/>
+          <w:sz w:val="24"/>
+          <w:szCs w:val="24"/>
+        </w:rPr>
+        <w:t xml:space="preserve">Définition — </w:t>
+      </w:r>
+      <w:r>
+        <w:rPr>
+          <w:rFonts w:ascii="Times New Roman" w:cs="Times New Roman" w:eastAsia="Times New Roman" w:hAnsi="Times New Roman"/>
+          <w:b/>
+          <w:bCs/>
+          <w:i w:val="false"/>
+          <w:iCs w:val="false"/>
+          <w:color w:val="000000"/>
+          <w:sz w:val="24"/>
+          <w:szCs w:val="24"/>
+        </w:rPr>
+        <w:t xml:space="preserve">Le signe égal (=) exprime une équivalence : il affirme que les expressions écrites à sa gauche et à sa droite ont exactement la même valeur. Deux expressions différentes peuvent être équivalentes : 7 + 5 = 10 + 2, car les deux valent 12.</w:t>
+      </w:r>
+    </w:p>
+    <w:p>
+      <w:pPr>
+        <w:spacing w:after="110" w:line="300"/>
+        <w:jc w:val="both"/>
+      </w:pPr>
+      <w:r>
+        <w:rPr>
+          <w:rFonts w:ascii="Times New Roman" w:cs="Times New Roman" w:eastAsia="Times New Roman" w:hAnsi="Times New Roman"/>
+          <w:b/>
+          <w:bCs/>
+          <w:i w:val="false"/>
+          <w:iCs w:val="false"/>
+          <w:color w:val="1F4E79"/>
+          <w:sz w:val="24"/>
+          <w:szCs w:val="24"/>
+        </w:rPr>
+        <w:t xml:space="preserve">Autrement dit : </w:t>
+      </w:r>
+      <w:r>
+        <w:rPr>
+          <w:rFonts w:ascii="Times New Roman" w:cs="Times New Roman" w:eastAsia="Times New Roman" w:hAnsi="Times New Roman"/>
+          <w:b w:val="false"/>
+          <w:bCs w:val="false"/>
+          <w:i w:val="false"/>
+          <w:iCs w:val="false"/>
+          <w:color w:val="000000"/>
+          <w:sz w:val="24"/>
+          <w:szCs w:val="24"/>
+        </w:rPr>
+        <w:t xml:space="preserve">le = est une balance en équilibre : ce qu’il y a à gauche pèse exactement autant que ce qu’il y a à droite.</w:t>
+      </w:r>
+    </w:p>
+    <w:p>
+      <w:pPr>
+        <w:spacing w:after="110" w:line="300"/>
+        <w:jc w:val="both"/>
+      </w:pPr>
+      <w:r>
+        <w:rPr>
+          <w:rFonts w:ascii="Times New Roman" w:cs="Times New Roman" w:eastAsia="Times New Roman" w:hAnsi="Times New Roman"/>
+          <w:b w:val="false"/>
+          <w:bCs w:val="false"/>
+          <w:i w:val="false"/>
+          <w:iCs w:val="false"/>
+          <w:color w:val="000000"/>
+          <w:sz w:val="24"/>
+          <w:szCs w:val="24"/>
+        </w:rPr>
+        <w:t xml:space="preserve">Depuis le CP, beaucoup lisent le = comme un bouton « résultat » de calculatrice : « 7 + 5 égale… 12 ! ». Cette lecture fait écrire des horreurs en chaîne comme « 7 + 5 = 12 + 3 = 15 » (faux : 7 + 5 ne vaut pas 15 !). La vraie lecture est symétrique : chaque côté est une expression, et le = certifie qu’elles pèsent pareil. D’où trois pouvoirs nouveaux. Compléter : 8 + □ = 6 + 7 → la droite pèse 13, donc □ = 5. Vérifier : 25 − 8 = 15 + 2 ? Gauche 17, droite 17 : vrai. Transformer : 99 + 46 = 100 + 45 — la compensation du calcul mental n’était qu’une égalité d’équivalence ! La balance à plateaux rend tout cela visible : on charge les deux plateaux, et l’aiguille dit la vérité.</w:t>
+      </w:r>
+    </w:p>
+    <w:p>
+      <w:pPr>
+        <w:spacing w:after="120" w:before="120"/>
+        <w:jc w:val="center"/>
+      </w:pPr>
+      <w:r>
+        <w:drawing>
+          <wp:inline distT="0" distB="0" distL="0" distR="0">
+            <wp:extent cx="4762500" cy="1895475"/>
+            <wp:effectExtent t="0" r="0" b="0" l="0"/>
+            <wp:docPr id="12" name="" descr="" title=""/>
+            <wp:cNvGraphicFramePr>
+              <a:graphicFrameLocks xmlns:a="http://schemas.openxmlformats.org/drawingml/2006/main" noChangeAspect="1"/>
+            </wp:cNvGraphicFramePr>
+            <a:graphic xmlns:a="http://schemas.openxmlformats.org/drawingml/2006/main">
+              <a:graphicData uri="http://schemas.openxmlformats.org/drawingml/2006/picture">
+                <pic:pic xmlns:pic="http://schemas.openxmlformats.org/drawingml/2006/picture">
+                  <pic:nvPicPr>
+                    <pic:cNvPr id="0" name="" descr=""/>
+                    <pic:cNvPicPr>
+                      <a:picLocks noChangeAspect="1" noChangeArrowheads="1"/>
+                    </pic:cNvPicPr>
+                  </pic:nvPicPr>
+                  <pic:blipFill>
+                    <a:blip r:embed="rId20" cstate="none"/>
                     <a:srcRect/>
                     <a:stretch>
                       <a:fillRect/>
@@ -20011,98 +20103,15 @@
     </w:p>
     <w:p>
       <w:pPr>
-        <w:spacing w:after="110" w:line="300"/>
-        <w:jc w:val="both"/>
-      </w:pPr>
-      <w:r>
-        <w:rPr>
-          <w:rFonts w:ascii="Times New Roman" w:cs="Times New Roman" w:eastAsia="Times New Roman" w:hAnsi="Times New Roman"/>
-          <w:b/>
-          <w:bCs/>
-          <w:i w:val="false"/>
-          <w:iCs w:val="false"/>
-          <w:color w:val="2E7D32"/>
-          <w:sz w:val="24"/>
-          <w:szCs w:val="24"/>
-        </w:rPr>
-        <w:t xml:space="preserve">Définition — </w:t>
-      </w:r>
-      <w:r>
-        <w:rPr>
-          <w:rFonts w:ascii="Times New Roman" w:cs="Times New Roman" w:eastAsia="Times New Roman" w:hAnsi="Times New Roman"/>
-          <w:b/>
-          <w:bCs/>
-          <w:i w:val="false"/>
-          <w:iCs w:val="false"/>
-          <w:color w:val="000000"/>
-          <w:sz w:val="24"/>
-          <w:szCs w:val="24"/>
-        </w:rPr>
-        <w:t xml:space="preserve">Une équation est une égalité qui comporte une valeur inconnue, souvent notée par une case vide ou une lettre. Résoudre l’équation, c’est trouver la valeur de l’inconnue qui rend l’égalité vraie. Les essais systématiques consistent à essayer des valeurs ordonnées, à comparer le résultat au but, et à resserrer jusqu’à la solution.</w:t>
-      </w:r>
-    </w:p>
-    <w:p>
-      <w:pPr>
-        <w:spacing w:after="110" w:line="300"/>
-        <w:jc w:val="both"/>
-      </w:pPr>
-      <w:r>
-        <w:rPr>
-          <w:rFonts w:ascii="Times New Roman" w:cs="Times New Roman" w:eastAsia="Times New Roman" w:hAnsi="Times New Roman"/>
-          <w:b/>
-          <w:bCs/>
-          <w:i w:val="false"/>
-          <w:iCs w:val="false"/>
-          <w:color w:val="1F4E79"/>
-          <w:sz w:val="24"/>
-          <w:szCs w:val="24"/>
-        </w:rPr>
-        <w:t xml:space="preserve">Autrement dit : </w:t>
-      </w:r>
-      <w:r>
-        <w:rPr>
-          <w:rFonts w:ascii="Times New Roman" w:cs="Times New Roman" w:eastAsia="Times New Roman" w:hAnsi="Times New Roman"/>
-          <w:b w:val="false"/>
-          <w:bCs w:val="false"/>
-          <w:i w:val="false"/>
-          <w:iCs w:val="false"/>
-          <w:color w:val="000000"/>
-          <w:sz w:val="24"/>
-          <w:szCs w:val="24"/>
-        </w:rPr>
-        <w:t xml:space="preserve">on cherche le nombre caché en jouant au « trop grand / trop petit », et chaque essai rapproche de la cible.</w:t>
-      </w:r>
-    </w:p>
-    <w:p>
-      <w:pPr>
-        <w:spacing w:after="110" w:line="300"/>
-        <w:jc w:val="both"/>
-      </w:pPr>
-      <w:r>
-        <w:rPr>
-          <w:rFonts w:ascii="Times New Roman" w:cs="Times New Roman" w:eastAsia="Times New Roman" w:hAnsi="Times New Roman"/>
-          <w:b w:val="false"/>
-          <w:bCs w:val="false"/>
-          <w:i w:val="false"/>
-          <w:iCs w:val="false"/>
-          <w:color w:val="000000"/>
-          <w:sz w:val="24"/>
-          <w:szCs w:val="24"/>
-        </w:rPr>
-        <w:t xml:space="preserve">Les essais systématiques ne sont pas des essais au hasard : chaque réponse ORIENTE le suivant. Pour 897 + □ = 917 : essai 10 → 907, trop petit, on monte ; essai 30 → 927, trop grand, on descend ; essai 20 → 917 ✓. On peut aussi raisonner par déduction avec l’opération inverse : □ = 917 − 897 = 20 — les deux chemins mènent au même trésor, et l’un vérifie l’autre. Le programme donne les trois visages de l’équation : 897 + □ = 917 (□ = 20), 897 − □ = 847 (□ = 50), 897 ÷ □ = 299 (□ = 3). Même jeu pour prédire les termes lointains d’une suite : avec la relation « quantité = 4 × rang », le 5ᵉ terme vaut 20, le 10ᵉ vaut 40, le 15ᵉ vaut 60 — la formule prédit l’avenir de la suite sans construire une seule figure. Toujours finir par la VÉRIFICATION : remplacer l’inconnue par la valeur trouvée et contrôler l’égalité.</w:t>
-      </w:r>
-    </w:p>
-    <w:p>
-      <w:pPr>
         <w:spacing w:after="120" w:before="120"/>
         <w:jc w:val="center"/>
       </w:pPr>
       <w:r>
         <w:drawing>
           <wp:inline distT="0" distB="0" distL="0" distR="0">
-            <wp:extent cx="4762500" cy="2057400"/>
+            <wp:extent cx="4095750" cy="2238375"/>
             <wp:effectExtent t="0" r="0" b="0" l="0"/>
-            <wp:docPr id="11" name="" descr="" title=""/>
+            <wp:docPr id="13" name="" descr="" title=""/>
             <wp:cNvGraphicFramePr>
               <a:graphicFrameLocks xmlns:a="http://schemas.openxmlformats.org/drawingml/2006/main" noChangeAspect="1"/>
             </wp:cNvGraphicFramePr>
@@ -20116,7 +20125,136 @@
                     </pic:cNvPicPr>
                   </pic:nvPicPr>
                   <pic:blipFill>
-                    <a:blip r:embed="rId19" cstate="none"/>
+                    <a:blip r:embed="rId21" cstate="none"/>
+                    <a:srcRect/>
+                    <a:stretch>
+                      <a:fillRect/>
+                    </a:stretch>
+                  </pic:blipFill>
+                  <pic:spPr bwMode="auto">
+                    <a:xfrm>
+                      <a:off x="0" y="0"/>
+                      <a:ext cx="4095750" cy="2238375"/>
+                    </a:xfrm>
+                    <a:prstGeom prst="rect">
+                      <a:avLst/>
+                    </a:prstGeom>
+                  </pic:spPr>
+                </pic:pic>
+              </a:graphicData>
+            </a:graphic>
+          </wp:inline>
+        </w:drawing>
+      </w:r>
+    </w:p>
+    <w:p>
+      <w:pPr>
+        <w:spacing w:after="110" w:line="300"/>
+        <w:jc w:val="both"/>
+      </w:pPr>
+      <w:r>
+        <w:rPr>
+          <w:rFonts w:ascii="Times New Roman" w:cs="Times New Roman" w:eastAsia="Times New Roman" w:hAnsi="Times New Roman"/>
+          <w:b/>
+          <w:bCs/>
+          <w:i w:val="false"/>
+          <w:iCs w:val="false"/>
+          <w:color w:val="2E7D32"/>
+          <w:sz w:val="24"/>
+          <w:szCs w:val="24"/>
+        </w:rPr>
+        <w:t xml:space="preserve">Définition — </w:t>
+      </w:r>
+      <w:r>
+        <w:rPr>
+          <w:rFonts w:ascii="Times New Roman" w:cs="Times New Roman" w:eastAsia="Times New Roman" w:hAnsi="Times New Roman"/>
+          <w:b/>
+          <w:bCs/>
+          <w:i w:val="false"/>
+          <w:iCs w:val="false"/>
+          <w:color w:val="000000"/>
+          <w:sz w:val="24"/>
+          <w:szCs w:val="24"/>
+        </w:rPr>
+        <w:t xml:space="preserve">Une équation est une égalité qui comporte une valeur inconnue, souvent notée par une case vide ou une lettre. Résoudre l’équation, c’est trouver la valeur de l’inconnue qui rend l’égalité vraie. Les essais systématiques consistent à essayer des valeurs ordonnées, à comparer le résultat au but, et à resserrer jusqu’à la solution.</w:t>
+      </w:r>
+    </w:p>
+    <w:p>
+      <w:pPr>
+        <w:spacing w:after="110" w:line="300"/>
+        <w:jc w:val="both"/>
+      </w:pPr>
+      <w:r>
+        <w:rPr>
+          <w:rFonts w:ascii="Times New Roman" w:cs="Times New Roman" w:eastAsia="Times New Roman" w:hAnsi="Times New Roman"/>
+          <w:b/>
+          <w:bCs/>
+          <w:i w:val="false"/>
+          <w:iCs w:val="false"/>
+          <w:color w:val="1F4E79"/>
+          <w:sz w:val="24"/>
+          <w:szCs w:val="24"/>
+        </w:rPr>
+        <w:t xml:space="preserve">Autrement dit : </w:t>
+      </w:r>
+      <w:r>
+        <w:rPr>
+          <w:rFonts w:ascii="Times New Roman" w:cs="Times New Roman" w:eastAsia="Times New Roman" w:hAnsi="Times New Roman"/>
+          <w:b w:val="false"/>
+          <w:bCs w:val="false"/>
+          <w:i w:val="false"/>
+          <w:iCs w:val="false"/>
+          <w:color w:val="000000"/>
+          <w:sz w:val="24"/>
+          <w:szCs w:val="24"/>
+        </w:rPr>
+        <w:t xml:space="preserve">on cherche le nombre caché en jouant au « trop grand / trop petit », et chaque essai rapproche de la cible.</w:t>
+      </w:r>
+    </w:p>
+    <w:p>
+      <w:pPr>
+        <w:spacing w:after="110" w:line="300"/>
+        <w:jc w:val="both"/>
+      </w:pPr>
+      <w:r>
+        <w:rPr>
+          <w:rFonts w:ascii="Times New Roman" w:cs="Times New Roman" w:eastAsia="Times New Roman" w:hAnsi="Times New Roman"/>
+          <w:b w:val="false"/>
+          <w:bCs w:val="false"/>
+          <w:i w:val="false"/>
+          <w:iCs w:val="false"/>
+          <w:color w:val="000000"/>
+          <w:sz w:val="24"/>
+          <w:szCs w:val="24"/>
+        </w:rPr>
+        <w:t xml:space="preserve">Les essais systématiques ne sont pas des essais au hasard : chaque réponse ORIENTE le suivant. Pour 897 + □ = 917 : essai 10 → 907, trop petit, on monte ; essai 30 → 927, trop grand, on descend ; essai 20 → 917 ✓. On peut aussi raisonner par déduction avec l’opération inverse : □ = 917 − 897 = 20 — les deux chemins mènent au même trésor, et l’un vérifie l’autre. Le programme donne les trois visages de l’équation : 897 + □ = 917 (□ = 20), 897 − □ = 847 (□ = 50), 897 ÷ □ = 299 (□ = 3). Même jeu pour prédire les termes lointains d’une suite : avec la relation « quantité = 4 × rang », le 5ᵉ terme vaut 20, le 10ᵉ vaut 40, le 15ᵉ vaut 60 — la formule prédit l’avenir de la suite sans construire une seule figure. Toujours finir par la VÉRIFICATION : remplacer l’inconnue par la valeur trouvée et contrôler l’égalité.</w:t>
+      </w:r>
+    </w:p>
+    <w:p>
+      <w:pPr>
+        <w:spacing w:after="120" w:before="120"/>
+        <w:jc w:val="center"/>
+      </w:pPr>
+      <w:r>
+        <w:drawing>
+          <wp:inline distT="0" distB="0" distL="0" distR="0">
+            <wp:extent cx="4762500" cy="2057400"/>
+            <wp:effectExtent t="0" r="0" b="0" l="0"/>
+            <wp:docPr id="14" name="" descr="" title=""/>
+            <wp:cNvGraphicFramePr>
+              <a:graphicFrameLocks xmlns:a="http://schemas.openxmlformats.org/drawingml/2006/main" noChangeAspect="1"/>
+            </wp:cNvGraphicFramePr>
+            <a:graphic xmlns:a="http://schemas.openxmlformats.org/drawingml/2006/main">
+              <a:graphicData uri="http://schemas.openxmlformats.org/drawingml/2006/picture">
+                <pic:pic xmlns:pic="http://schemas.openxmlformats.org/drawingml/2006/picture">
+                  <pic:nvPicPr>
+                    <pic:cNvPr id="0" name="" descr=""/>
+                    <pic:cNvPicPr>
+                      <a:picLocks noChangeAspect="1" noChangeArrowheads="1"/>
+                    </pic:cNvPicPr>
+                  </pic:nvPicPr>
+                  <pic:blipFill>
+                    <a:blip r:embed="rId22" cstate="none"/>
                     <a:srcRect/>
                     <a:stretch>
                       <a:fillRect/>

</xml_diff>

<commit_message>
Math T5: pages d'entrée d'unité (6) + formules complètes A/P avec inverses (DP, c=P÷4, aire disque, d=C÷3,14, retrouver côté/base)
Co-authored-by: arena-agent <297053741+arena-agent@users.noreply.github.com>
</commit_message>
<xml_diff>
--- a/manuel-math-t5/Manuel_Mathematiques_T5_UNITE3.docx
+++ b/manuel-math-t5/Manuel_Mathematiques_T5_UNITE3.docx
@@ -9,10 +9,150 @@
     </w:p>
     <w:p>
       <w:pPr>
+        <w:spacing w:after="200" w:before="2200"/>
+        <w:jc w:val="center"/>
+      </w:pPr>
+      <w:r>
+        <w:rPr>
+          <w:rFonts w:ascii="Times New Roman" w:cs="Times New Roman" w:eastAsia="Times New Roman" w:hAnsi="Times New Roman"/>
+          <w:b/>
+          <w:bCs/>
+          <w:i w:val="false"/>
+          <w:iCs w:val="false"/>
+          <w:color w:val="1F4E79"/>
+          <w:sz w:val="76"/>
+          <w:szCs w:val="76"/>
+        </w:rPr>
+        <w:t xml:space="preserve">UNITÉ III</w:t>
+      </w:r>
+    </w:p>
+    <w:p>
+      <w:pPr>
+        <w:shd w:fill="EAF2F8" w:val="clear"/>
+        <w:spacing w:after="160"/>
+        <w:jc w:val="center"/>
+      </w:pPr>
+      <w:bookmarkStart w:name="u3" w:id="1"/>
+      <w:r>
+        <w:rPr>
+          <w:rFonts w:ascii="Times New Roman" w:cs="Times New Roman" w:eastAsia="Times New Roman" w:hAnsi="Times New Roman"/>
+          <w:b/>
+          <w:bCs/>
+          <w:i w:val="false"/>
+          <w:iCs w:val="false"/>
+          <w:color w:val="C00000"/>
+          <w:sz w:val="56"/>
+          <w:szCs w:val="56"/>
+        </w:rPr>
+        <w:t xml:space="preserve">ALGÈBRE</w:t>
+      </w:r>
+      <w:bookmarkEnd w:id="1"/>
+    </w:p>
+    <w:p>
+      <w:pPr>
+        <w:spacing w:after="400"/>
+        <w:jc w:val="center"/>
+      </w:pPr>
+      <w:r>
+        <w:rPr>
+          <w:rFonts w:ascii="Times New Roman" w:cs="Times New Roman" w:eastAsia="Times New Roman" w:hAnsi="Times New Roman"/>
+          <w:b w:val="false"/>
+          <w:bCs w:val="false"/>
+          <w:i/>
+          <w:iCs/>
+          <w:color w:val="2E7D32"/>
+          <w:sz w:val="24"/>
+          <w:szCs w:val="24"/>
+        </w:rPr>
+        <w:t xml:space="preserve">Sous-discipline du programme de Mathématiques T5</w:t>
+      </w:r>
+    </w:p>
+    <w:p>
+      <w:pPr>
+        <w:spacing w:after="120"/>
+        <w:jc w:val="center"/>
+      </w:pPr>
+      <w:r>
+        <w:rPr>
+          <w:rFonts w:ascii="Times New Roman" w:cs="Times New Roman" w:eastAsia="Times New Roman" w:hAnsi="Times New Roman"/>
+          <w:b/>
+          <w:bCs/>
+          <w:i w:val="false"/>
+          <w:iCs w:val="false"/>
+          <w:color w:val="C2185B"/>
+          <w:sz w:val="24"/>
+          <w:szCs w:val="24"/>
+        </w:rPr>
+        <w:t xml:space="preserve">Résultat d’apprentissage général</w:t>
+      </w:r>
+    </w:p>
+    <w:p>
+      <w:pPr>
+        <w:spacing w:after="300"/>
+        <w:jc w:val="center"/>
+      </w:pPr>
+      <w:r>
+        <w:rPr>
+          <w:rFonts w:ascii="Times New Roman" w:cs="Times New Roman" w:eastAsia="Times New Roman" w:hAnsi="Times New Roman"/>
+          <w:b w:val="false"/>
+          <w:bCs w:val="false"/>
+          <w:i w:val="false"/>
+          <w:iCs w:val="false"/>
+          <w:color w:val="000000"/>
+          <w:sz w:val="24"/>
+          <w:szCs w:val="24"/>
+        </w:rPr>
+        <w:t xml:space="preserve">comprendre des relations simples à partir de suites, de situations de proportionnalité et de situations d’égalité.</w:t>
+      </w:r>
+    </w:p>
+    <w:p>
+      <w:pPr>
+        <w:spacing w:after="120"/>
+        <w:jc w:val="center"/>
+      </w:pPr>
+      <w:r>
+        <w:rPr>
+          <w:rFonts w:ascii="Times New Roman" w:cs="Times New Roman" w:eastAsia="Times New Roman" w:hAnsi="Times New Roman"/>
+          <w:b/>
+          <w:bCs/>
+          <w:i w:val="false"/>
+          <w:iCs w:val="false"/>
+          <w:color w:val="C2185B"/>
+          <w:sz w:val="24"/>
+          <w:szCs w:val="24"/>
+        </w:rPr>
+        <w:t xml:space="preserve">Valeurs à véhiculer</w:t>
+      </w:r>
+    </w:p>
+    <w:p>
+      <w:pPr>
+        <w:spacing w:after="200"/>
+        <w:jc w:val="center"/>
+      </w:pPr>
+      <w:r>
+        <w:rPr>
+          <w:rFonts w:ascii="Times New Roman" w:cs="Times New Roman" w:eastAsia="Times New Roman" w:hAnsi="Times New Roman"/>
+          <w:b w:val="false"/>
+          <w:bCs w:val="false"/>
+          <w:i w:val="false"/>
+          <w:iCs w:val="false"/>
+          <w:color w:val="000000"/>
+          <w:sz w:val="24"/>
+          <w:szCs w:val="24"/>
+        </w:rPr>
+        <w:t xml:space="preserve">esprit de créativité et goût de l’effort.</w:t>
+      </w:r>
+    </w:p>
+    <w:p>
+      <w:r>
+        <w:br w:type="page"/>
+      </w:r>
+    </w:p>
+    <w:p>
+      <w:pPr>
         <w:spacing w:after="150" w:before="200"/>
         <w:jc w:val="center"/>
       </w:pPr>
-      <w:bookmarkStart w:name="u3" w:id="1"/>
       <w:r>
         <w:rPr>
           <w:rFonts w:ascii="Times New Roman" w:cs="Times New Roman" w:eastAsia="Times New Roman" w:hAnsi="Times New Roman"/>
@@ -24,14 +164,17 @@
           <w:sz w:val="32"/>
           <w:szCs w:val="32"/>
         </w:rPr>
-        <w:t xml:space="preserve">UNITÉ III — ALGÈBRE</w:t>
-      </w:r>
-      <w:bookmarkEnd w:id="1"/>
-    </w:p>
-    <w:p>
-      <w:pPr>
-        <w:spacing w:after="110" w:line="300"/>
-        <w:jc w:val="both"/>
+        <w:t xml:space="preserve">UNITÉ III — ALGÈBRE : DANS CETTE UNITÉ</w:t>
+      </w:r>
+    </w:p>
+    <w:p>
+      <w:pPr>
+        <w:pStyle w:val="ListParagraph"/>
+        <w:numPr>
+          <w:ilvl w:val="0"/>
+          <w:numId w:val="1"/>
+        </w:numPr>
+        <w:spacing w:after="80"/>
       </w:pPr>
       <w:r>
         <w:rPr>
@@ -44,13 +187,17 @@
           <w:sz w:val="24"/>
           <w:szCs w:val="24"/>
         </w:rPr>
-        <w:t xml:space="preserve">Résultat d’apprentissage général : comprendre des relations simples à partir de suites, de situations de proportionnalité et de situations d’égalité.</w:t>
-      </w:r>
-    </w:p>
-    <w:p>
-      <w:pPr>
-        <w:spacing w:after="110" w:line="300"/>
-        <w:jc w:val="both"/>
+        <w:t xml:space="preserve">Séance 1 — Découvrir les suites et leurs régularités</w:t>
+      </w:r>
+    </w:p>
+    <w:p>
+      <w:pPr>
+        <w:pStyle w:val="ListParagraph"/>
+        <w:numPr>
+          <w:ilvl w:val="0"/>
+          <w:numId w:val="1"/>
+        </w:numPr>
+        <w:spacing w:after="80"/>
       </w:pPr>
       <w:r>
         <w:rPr>
@@ -63,7 +210,168 @@
           <w:sz w:val="24"/>
           <w:szCs w:val="24"/>
         </w:rPr>
-        <w:t xml:space="preserve">Valeurs à véhiculer : esprit de créativité et goût de l’effort.</w:t>
+        <w:t xml:space="preserve">Séance 2 — Le rang d’un terme : relier le rang à la quantité</w:t>
+      </w:r>
+    </w:p>
+    <w:p>
+      <w:pPr>
+        <w:pStyle w:val="ListParagraph"/>
+        <w:numPr>
+          <w:ilvl w:val="0"/>
+          <w:numId w:val="1"/>
+        </w:numPr>
+        <w:spacing w:after="80"/>
+      </w:pPr>
+      <w:r>
+        <w:rPr>
+          <w:rFonts w:ascii="Times New Roman" w:cs="Times New Roman" w:eastAsia="Times New Roman" w:hAnsi="Times New Roman"/>
+          <w:b w:val="false"/>
+          <w:bCs w:val="false"/>
+          <w:i w:val="false"/>
+          <w:iCs w:val="false"/>
+          <w:color w:val="000000"/>
+          <w:sz w:val="24"/>
+          <w:szCs w:val="24"/>
+        </w:rPr>
+        <w:t xml:space="preserve">Séance 3 — Les tableaux de valeurs</w:t>
+      </w:r>
+    </w:p>
+    <w:p>
+      <w:pPr>
+        <w:pStyle w:val="ListParagraph"/>
+        <w:numPr>
+          <w:ilvl w:val="0"/>
+          <w:numId w:val="1"/>
+        </w:numPr>
+        <w:spacing w:after="80"/>
+      </w:pPr>
+      <w:r>
+        <w:rPr>
+          <w:rFonts w:ascii="Times New Roman" w:cs="Times New Roman" w:eastAsia="Times New Roman" w:hAnsi="Times New Roman"/>
+          <w:b w:val="false"/>
+          <w:bCs w:val="false"/>
+          <w:i w:val="false"/>
+          <w:iCs w:val="false"/>
+          <w:color w:val="000000"/>
+          <w:sz w:val="24"/>
+          <w:szCs w:val="24"/>
+        </w:rPr>
+        <w:t xml:space="preserve">Séance 4 — La correspondance entre deux quantités</w:t>
+      </w:r>
+    </w:p>
+    <w:p>
+      <w:pPr>
+        <w:pStyle w:val="ListParagraph"/>
+        <w:numPr>
+          <w:ilvl w:val="0"/>
+          <w:numId w:val="1"/>
+        </w:numPr>
+        <w:spacing w:after="80"/>
+      </w:pPr>
+      <w:r>
+        <w:rPr>
+          <w:rFonts w:ascii="Times New Roman" w:cs="Times New Roman" w:eastAsia="Times New Roman" w:hAnsi="Times New Roman"/>
+          <w:b w:val="false"/>
+          <w:bCs w:val="false"/>
+          <w:i w:val="false"/>
+          <w:iCs w:val="false"/>
+          <w:color w:val="000000"/>
+          <w:sz w:val="24"/>
+          <w:szCs w:val="24"/>
+        </w:rPr>
+        <w:t xml:space="preserve">Séance 5 — La règle de trois</w:t>
+      </w:r>
+    </w:p>
+    <w:p>
+      <w:pPr>
+        <w:pStyle w:val="ListParagraph"/>
+        <w:numPr>
+          <w:ilvl w:val="0"/>
+          <w:numId w:val="1"/>
+        </w:numPr>
+        <w:spacing w:after="80"/>
+      </w:pPr>
+      <w:r>
+        <w:rPr>
+          <w:rFonts w:ascii="Times New Roman" w:cs="Times New Roman" w:eastAsia="Times New Roman" w:hAnsi="Times New Roman"/>
+          <w:b w:val="false"/>
+          <w:bCs w:val="false"/>
+          <w:i w:val="false"/>
+          <w:iCs w:val="false"/>
+          <w:color w:val="000000"/>
+          <w:sz w:val="24"/>
+          <w:szCs w:val="24"/>
+        </w:rPr>
+        <w:t xml:space="preserve">Séance 6 — Le sens du signe égal</w:t>
+      </w:r>
+    </w:p>
+    <w:p>
+      <w:pPr>
+        <w:pStyle w:val="ListParagraph"/>
+        <w:numPr>
+          <w:ilvl w:val="0"/>
+          <w:numId w:val="1"/>
+        </w:numPr>
+        <w:spacing w:after="80"/>
+      </w:pPr>
+      <w:r>
+        <w:rPr>
+          <w:rFonts w:ascii="Times New Roman" w:cs="Times New Roman" w:eastAsia="Times New Roman" w:hAnsi="Times New Roman"/>
+          <w:b w:val="false"/>
+          <w:bCs w:val="false"/>
+          <w:i w:val="false"/>
+          <w:iCs w:val="false"/>
+          <w:color w:val="000000"/>
+          <w:sz w:val="24"/>
+          <w:szCs w:val="24"/>
+        </w:rPr>
+        <w:t xml:space="preserve">Séance 7 — Trouver la valeur inconnue</w:t>
+      </w:r>
+    </w:p>
+    <w:p>
+      <w:pPr>
+        <w:pStyle w:val="ListParagraph"/>
+        <w:numPr>
+          <w:ilvl w:val="0"/>
+          <w:numId w:val="1"/>
+        </w:numPr>
+        <w:spacing w:after="80"/>
+      </w:pPr>
+      <w:r>
+        <w:rPr>
+          <w:rFonts w:ascii="Times New Roman" w:cs="Times New Roman" w:eastAsia="Times New Roman" w:hAnsi="Times New Roman"/>
+          <w:b w:val="false"/>
+          <w:bCs w:val="false"/>
+          <w:i w:val="false"/>
+          <w:iCs w:val="false"/>
+          <w:color w:val="000000"/>
+          <w:sz w:val="24"/>
+          <w:szCs w:val="24"/>
+        </w:rPr>
+        <w:t xml:space="preserve">Séance 8 — Révision de l’unité III</w:t>
+      </w:r>
+    </w:p>
+    <w:p>
+      <w:pPr>
+        <w:pStyle w:val="ListParagraph"/>
+        <w:numPr>
+          <w:ilvl w:val="0"/>
+          <w:numId w:val="1"/>
+        </w:numPr>
+        <w:spacing w:after="80"/>
+      </w:pPr>
+      <w:r>
+        <w:rPr>
+          <w:rFonts w:ascii="Times New Roman" w:cs="Times New Roman" w:eastAsia="Times New Roman" w:hAnsi="Times New Roman"/>
+          <w:b w:val="false"/>
+          <w:bCs w:val="false"/>
+          <w:i w:val="false"/>
+          <w:iCs w:val="false"/>
+          <w:color w:val="000000"/>
+          <w:sz w:val="24"/>
+          <w:szCs w:val="24"/>
+        </w:rPr>
+        <w:t xml:space="preserve">Séance 9 — Sujet d’examen format CEPE</w:t>
       </w:r>
     </w:p>
     <w:p>

</xml_diff>

<commit_message>
Math T5: 20 sujets Opérations + 20 sujets Problèmes type CEPE (originaux, corrigés démarche complète, avant annexes, liens sommaire) + allègement 39→17,9 Mo (PNG palette + JPEG recompressés)
Co-authored-by: arena-agent <297053741+arena-agent@users.noreply.github.com>
</commit_message>
<xml_diff>
--- a/manuel-math-t5/Manuel_Mathematiques_T5_UNITE3.docx
+++ b/manuel-math-t5/Manuel_Mathematiques_T5_UNITE3.docx
@@ -6569,7 +6569,7 @@
       <w:r>
         <w:drawing>
           <wp:inline distT="0" distB="0" distL="0" distR="0">
-            <wp:extent cx="4762500" cy="1962150"/>
+            <wp:extent cx="4762500" cy="1971675"/>
             <wp:effectExtent t="0" r="0" b="0" l="0"/>
             <wp:docPr id="5" name=""/>
             <wp:cNvGraphicFramePr>
@@ -6594,7 +6594,7 @@
                   <pic:spPr bwMode="auto">
                     <a:xfrm>
                       <a:off x="0" y="0"/>
-                      <a:ext cx="4762500" cy="1962150"/>
+                      <a:ext cx="4762500" cy="1971675"/>
                     </a:xfrm>
                     <a:prstGeom prst="rect">
                       <a:avLst/>
@@ -13181,7 +13181,7 @@
       <w:r>
         <w:drawing>
           <wp:inline distT="0" distB="0" distL="0" distR="0">
-            <wp:extent cx="4762500" cy="1809750"/>
+            <wp:extent cx="4762500" cy="1819275"/>
             <wp:effectExtent t="0" r="0" b="0" l="0"/>
             <wp:docPr id="11" name=""/>
             <wp:cNvGraphicFramePr>
@@ -13206,7 +13206,7 @@
                   <pic:spPr bwMode="auto">
                     <a:xfrm>
                       <a:off x="0" y="0"/>
-                      <a:ext cx="4762500" cy="1809750"/>
+                      <a:ext cx="4762500" cy="1819275"/>
                     </a:xfrm>
                     <a:prstGeom prst="rect">
                       <a:avLst/>

</xml_diff>